<commit_message>
Broaden headline specialty to AI and product evaluation and measurement
Co-Authored-By: Claude Opus 5.5 <noreply@anthropic.com>
Claude-Session: https://claude.ai/code/session_01B8nZ9VUdwBLJ6MyzTiP48K
</commit_message>
<xml_diff>
--- a/docs/assets/resume/Jennifer_Waldern_Resume.docx
+++ b/docs/assets/resume/Jennifer_Waldern_Resume.docx
@@ -35,7 +35,7 @@
           <w:sz w:val="20"/>
           <w:szCs w:val="20"/>
         </w:rPr>
-        <w:t xml:space="preserve">DATA SCIENCE &amp; AI ARCHITECT  ·  AI EVALUATION &amp; MEASUREMENT</w:t>
+        <w:t xml:space="preserve">DATA SCIENCE &amp; AI ARCHITECT  ·  AI AND PRODUCT EVALUATION &amp; MEASUREMENT</w:t>
       </w:r>
     </w:p>
     <w:p>
@@ -77,7 +77,7 @@
         </w:rPr>
         <w:t xml:space="preserve">   |   </w:t>
       </w:r>
-      <w:hyperlink w:history="1" r:id="rId6im4bgawjxu4p9xz6ogzn">
+      <w:hyperlink w:history="1" r:id="rIdmde_uo2ln-kmnjqowzaoy">
         <w:r>
           <w:rPr>
             <w:rFonts w:ascii="Calibri" w:cs="Calibri" w:eastAsia="Calibri" w:hAnsi="Calibri"/>
@@ -95,7 +95,7 @@
         <w:spacing w:after="40"/>
         <w:jc w:val="right"/>
       </w:pPr>
-      <w:hyperlink w:history="1" r:id="rIdbig-qku8cderhjdkoutl3">
+      <w:hyperlink w:history="1" r:id="rId3pc5qmqwzbp7raitmitxr">
         <w:r>
           <w:rPr>
             <w:rFonts w:ascii="Calibri" w:cs="Calibri" w:eastAsia="Calibri" w:hAnsi="Calibri"/>
@@ -116,7 +116,7 @@
         </w:rPr>
         <w:t xml:space="preserve">   |   </w:t>
       </w:r>
-      <w:hyperlink w:history="1" r:id="rId9zwcdwv9qwofvezek__eb">
+      <w:hyperlink w:history="1" r:id="rIdikm5gwntbxmflxzof8kmy">
         <w:r>
           <w:rPr>
             <w:rFonts w:ascii="Calibri" w:cs="Calibri" w:eastAsia="Calibri" w:hAnsi="Calibri"/>
@@ -137,7 +137,7 @@
         </w:rPr>
         <w:t xml:space="preserve">   |   </w:t>
       </w:r>
-      <w:hyperlink w:history="1" r:id="rIdv6kgy6v_t29dnxhx6h8wy">
+      <w:hyperlink w:history="1" r:id="rIdqinznaruk1tnfcstzfsml">
         <w:r>
           <w:rPr>
             <w:rFonts w:ascii="Calibri" w:cs="Calibri" w:eastAsia="Calibri" w:hAnsi="Calibri"/>
@@ -206,7 +206,7 @@
           <w:sz w:val="19"/>
           <w:szCs w:val="19"/>
         </w:rPr>
-        <w:t xml:space="preserve">AI evaluation and measurement</w:t>
+        <w:t xml:space="preserve">AI and product evaluation and measurement</w:t>
       </w:r>
       <w:r>
         <w:rPr>

</xml_diff>

<commit_message>
Tighten summary wording to cut repeated 'and' clauses
Co-Authored-By: Claude Opus 5.5 <noreply@anthropic.com>
Claude-Session: https://claude.ai/code/session_01B8nZ9VUdwBLJ6MyzTiP48K
</commit_message>
<xml_diff>
--- a/docs/assets/resume/Jennifer_Waldern_Resume.docx
+++ b/docs/assets/resume/Jennifer_Waldern_Resume.docx
@@ -77,7 +77,7 @@
         </w:rPr>
         <w:t xml:space="preserve">   |   </w:t>
       </w:r>
-      <w:hyperlink w:history="1" r:id="rIdmde_uo2ln-kmnjqowzaoy">
+      <w:hyperlink w:history="1" r:id="rIdjkzymxyu3nz-xamabf8ur">
         <w:r>
           <w:rPr>
             <w:rFonts w:ascii="Calibri" w:cs="Calibri" w:eastAsia="Calibri" w:hAnsi="Calibri"/>
@@ -95,7 +95,7 @@
         <w:spacing w:after="40"/>
         <w:jc w:val="right"/>
       </w:pPr>
-      <w:hyperlink w:history="1" r:id="rId3pc5qmqwzbp7raitmitxr">
+      <w:hyperlink w:history="1" r:id="rId77ukacrharg9zrk22uetl">
         <w:r>
           <w:rPr>
             <w:rFonts w:ascii="Calibri" w:cs="Calibri" w:eastAsia="Calibri" w:hAnsi="Calibri"/>
@@ -116,7 +116,7 @@
         </w:rPr>
         <w:t xml:space="preserve">   |   </w:t>
       </w:r>
-      <w:hyperlink w:history="1" r:id="rIdikm5gwntbxmflxzof8kmy">
+      <w:hyperlink w:history="1" r:id="rIdq96x5mrbxycomt-avo8xr">
         <w:r>
           <w:rPr>
             <w:rFonts w:ascii="Calibri" w:cs="Calibri" w:eastAsia="Calibri" w:hAnsi="Calibri"/>
@@ -137,7 +137,7 @@
         </w:rPr>
         <w:t xml:space="preserve">   |   </w:t>
       </w:r>
-      <w:hyperlink w:history="1" r:id="rIdqinznaruk1tnfcstzfsml">
+      <w:hyperlink w:history="1" r:id="rIdwqjpklyhgst_2y0dh3z1y">
         <w:r>
           <w:rPr>
             <w:rFonts w:ascii="Calibri" w:cs="Calibri" w:eastAsia="Calibri" w:hAnsi="Calibri"/>
@@ -206,15 +206,15 @@
           <w:sz w:val="19"/>
           <w:szCs w:val="19"/>
         </w:rPr>
-        <w:t xml:space="preserve">AI and product evaluation and measurement</w:t>
-      </w:r>
-      <w:r>
-        <w:rPr>
-          <w:rFonts w:ascii="Calibri" w:cs="Calibri" w:eastAsia="Calibri" w:hAnsi="Calibri"/>
-          <w:sz w:val="19"/>
-          <w:szCs w:val="19"/>
-        </w:rPr>
-        <w:t xml:space="preserve">, experimentation, and data and AI architecture. </w:t>
+        <w:t xml:space="preserve">AI and product evaluation, measurement, and experimentation</w:t>
+      </w:r>
+      <w:r>
+        <w:rPr>
+          <w:rFonts w:ascii="Calibri" w:cs="Calibri" w:eastAsia="Calibri" w:hAnsi="Calibri"/>
+          <w:sz w:val="19"/>
+          <w:szCs w:val="19"/>
+        </w:rPr>
+        <w:t xml:space="preserve">. </w:t>
       </w:r>
       <w:r>
         <w:rPr>
@@ -250,7 +250,7 @@
           <w:sz w:val="19"/>
           <w:szCs w:val="19"/>
         </w:rPr>
-        <w:t xml:space="preserve">, owning executive-facing metrics, forecasts, and roadmap inputs, and identifying the features that drive engagement and retention. Builds LLM evaluation harnesses, custom MCP servers, and multi-agent workflows, and turns ambiguous problems into trusted metrics and AI systems that teams adopt. Pursuing an MSc in Epistemology, Ethics and Mind at the University of Edinburgh.</w:t>
+        <w:t xml:space="preserve">, owning executive-facing metrics, forecasts, and roadmap inputs, including which features drive engagement and retention. Builds LLM evaluation harnesses, custom MCP servers, and multi-agent workflows that turn ambiguous problems into trusted metrics and AI systems teams adopt. Pursuing an MSc in Epistemology, Ethics and Mind at the University of Edinburgh.</w:t>
       </w:r>
     </w:p>
     <w:p>

</xml_diff>

<commit_message>
Update Windows data science tenure to 8 years
Co-Authored-By: Claude Opus 5.5 <noreply@anthropic.com>
Claude-Session: https://claude.ai/code/session_01B8nZ9VUdwBLJ6MyzTiP48K
</commit_message>
<xml_diff>
--- a/docs/assets/resume/Jennifer_Waldern_Resume.docx
+++ b/docs/assets/resume/Jennifer_Waldern_Resume.docx
@@ -77,7 +77,7 @@
         </w:rPr>
         <w:t xml:space="preserve">   |   </w:t>
       </w:r>
-      <w:hyperlink w:history="1" r:id="rIdjkzymxyu3nz-xamabf8ur">
+      <w:hyperlink w:history="1" r:id="rIdqevui9-catydkq9pape0c">
         <w:r>
           <w:rPr>
             <w:rFonts w:ascii="Calibri" w:cs="Calibri" w:eastAsia="Calibri" w:hAnsi="Calibri"/>
@@ -95,7 +95,7 @@
         <w:spacing w:after="40"/>
         <w:jc w:val="right"/>
       </w:pPr>
-      <w:hyperlink w:history="1" r:id="rId77ukacrharg9zrk22uetl">
+      <w:hyperlink w:history="1" r:id="rIddg3jpblervprtdapqfzdf">
         <w:r>
           <w:rPr>
             <w:rFonts w:ascii="Calibri" w:cs="Calibri" w:eastAsia="Calibri" w:hAnsi="Calibri"/>
@@ -116,7 +116,7 @@
         </w:rPr>
         <w:t xml:space="preserve">   |   </w:t>
       </w:r>
-      <w:hyperlink w:history="1" r:id="rIdq96x5mrbxycomt-avo8xr">
+      <w:hyperlink w:history="1" r:id="rIdepexdn5a-0gicxzc13p_n">
         <w:r>
           <w:rPr>
             <w:rFonts w:ascii="Calibri" w:cs="Calibri" w:eastAsia="Calibri" w:hAnsi="Calibri"/>
@@ -137,7 +137,7 @@
         </w:rPr>
         <w:t xml:space="preserve">   |   </w:t>
       </w:r>
-      <w:hyperlink w:history="1" r:id="rIdwqjpklyhgst_2y0dh3z1y">
+      <w:hyperlink w:history="1" r:id="rIdkzmkils32m8jlj05d3btq">
         <w:r>
           <w:rPr>
             <w:rFonts w:ascii="Calibri" w:cs="Calibri" w:eastAsia="Calibri" w:hAnsi="Calibri"/>
@@ -224,7 +224,7 @@
           <w:sz w:val="19"/>
           <w:szCs w:val="19"/>
         </w:rPr>
-        <w:t xml:space="preserve">7+ years</w:t>
+        <w:t xml:space="preserve">8 years</w:t>
       </w:r>
       <w:r>
         <w:rPr>

</xml_diff>